<commit_message>
docs: update development report with Phase 14 git record
</commit_message>
<xml_diff>
--- a/Antigravity_Gelistirme_Raporu.docx
+++ b/Antigravity_Gelistirme_Raporu.docx
@@ -199,7 +199,7 @@
                 <w:color w:val="1E293B"/>
                 <w:sz w:val="19"/>
               </w:rPr>
-              <w:t>24.08.2026 20:15</w:t>
+              <w:t>24.08.2026 20:16</w:t>
             </w:r>
           </w:p>
         </w:tc>
@@ -1960,6 +1960,110 @@
           </w:p>
         </w:tc>
       </w:tr>
+      <w:tr>
+        <w:tc>
+          <w:tcPr>
+            <w:tcW w:type="dxa" w:w="2340"/>
+            <w:shd w:fill="F8FAFC"/>
+            <w:tcMar>
+              <w:top w:w="70" w:type="dxa"/>
+              <w:bottom w:w="70" w:type="dxa"/>
+              <w:left w:w="80" w:type="dxa"/>
+              <w:right w:w="80" w:type="dxa"/>
+            </w:tcMar>
+          </w:tcPr>
+          <w:p>
+            <w:pPr>
+              <w:spacing w:after="0"/>
+              <w:jc w:val="center"/>
+            </w:pPr>
+            <w:r>
+              <w:rPr>
+                <w:b/>
+                <w:color w:val="0F172A"/>
+                <w:sz w:val="18"/>
+              </w:rPr>
+              <w:t>Phase 14</w:t>
+            </w:r>
+          </w:p>
+        </w:tc>
+        <w:tc>
+          <w:tcPr>
+            <w:tcW w:type="dxa" w:w="2340"/>
+            <w:shd w:fill="F8FAFC"/>
+            <w:tcMar>
+              <w:top w:w="70" w:type="dxa"/>
+              <w:bottom w:w="70" w:type="dxa"/>
+              <w:left w:w="80" w:type="dxa"/>
+              <w:right w:w="80" w:type="dxa"/>
+            </w:tcMar>
+          </w:tcPr>
+          <w:p>
+            <w:pPr>
+              <w:spacing w:after="0"/>
+              <w:jc w:val="center"/>
+            </w:pPr>
+            <w:r>
+              <w:rPr>
+                <w:color w:val="64748B"/>
+                <w:sz w:val="18"/>
+              </w:rPr>
+              <w:t>2026-08-24</w:t>
+            </w:r>
+          </w:p>
+        </w:tc>
+        <w:tc>
+          <w:tcPr>
+            <w:tcW w:type="dxa" w:w="2340"/>
+            <w:shd w:fill="F8FAFC"/>
+            <w:tcMar>
+              <w:top w:w="70" w:type="dxa"/>
+              <w:bottom w:w="70" w:type="dxa"/>
+              <w:left w:w="80" w:type="dxa"/>
+              <w:right w:w="80" w:type="dxa"/>
+            </w:tcMar>
+          </w:tcPr>
+          <w:p>
+            <w:pPr>
+              <w:spacing w:after="0"/>
+              <w:jc w:val="center"/>
+            </w:pPr>
+            <w:r>
+              <w:rPr>
+                <w:rFonts w:ascii="Consolas" w:hAnsi="Consolas"/>
+                <w:b/>
+                <w:color w:val="1E40AF"/>
+                <w:sz w:val="17"/>
+              </w:rPr>
+              <w:t>1649287</w:t>
+            </w:r>
+          </w:p>
+        </w:tc>
+        <w:tc>
+          <w:tcPr>
+            <w:tcW w:type="dxa" w:w="2340"/>
+            <w:shd w:fill="F8FAFC"/>
+            <w:tcMar>
+              <w:top w:w="70" w:type="dxa"/>
+              <w:bottom w:w="70" w:type="dxa"/>
+              <w:left w:w="100" w:type="dxa"/>
+              <w:right w:w="100" w:type="dxa"/>
+            </w:tcMar>
+          </w:tcPr>
+          <w:p>
+            <w:pPr>
+              <w:spacing w:after="0"/>
+            </w:pPr>
+            <w:r>
+              <w:rPr>
+                <w:color w:val="1E293B"/>
+                <w:sz w:val="18"/>
+              </w:rPr>
+              <w:t>feat: complete Phase 14 - Automated Word Document Generator</w:t>
+            </w:r>
+          </w:p>
+        </w:tc>
+      </w:tr>
     </w:tbl>
     <w:p>
       <w:pPr>

</xml_diff>

<commit_message>
feat: complete Phase 15 - Electronic Warfare and Jammer Simulation
</commit_message>
<xml_diff>
--- a/Antigravity_Gelistirme_Raporu.docx
+++ b/Antigravity_Gelistirme_Raporu.docx
@@ -29,7 +29,7 @@
           <w:color w:val="00994C"/>
           <w:sz w:val="26"/>
         </w:rPr>
-        <w:t>Sistem Mimarisi ve Aşama Geliştirme Raporu (Phase 1 - 14)</w:t>
+        <w:t>Sistem Mimarisi ve Aşama Geliştirme Raporu (Phase 1 - 15)</w:t>
       </w:r>
     </w:p>
     <w:tbl>
@@ -199,7 +199,7 @@
                 <w:color w:val="1E293B"/>
                 <w:sz w:val="19"/>
               </w:rPr>
-              <w:t>24.08.2026 20:16</w:t>
+              <w:t>24.08.2026 21:23</w:t>
             </w:r>
           </w:p>
         </w:tc>
@@ -2064,6 +2064,110 @@
           </w:p>
         </w:tc>
       </w:tr>
+      <w:tr>
+        <w:tc>
+          <w:tcPr>
+            <w:tcW w:type="dxa" w:w="2340"/>
+            <w:shd w:fill="FFFFFF"/>
+            <w:tcMar>
+              <w:top w:w="70" w:type="dxa"/>
+              <w:bottom w:w="70" w:type="dxa"/>
+              <w:left w:w="80" w:type="dxa"/>
+              <w:right w:w="80" w:type="dxa"/>
+            </w:tcMar>
+          </w:tcPr>
+          <w:p>
+            <w:pPr>
+              <w:spacing w:after="0"/>
+              <w:jc w:val="center"/>
+            </w:pPr>
+            <w:r>
+              <w:rPr>
+                <w:b/>
+                <w:color w:val="0F172A"/>
+                <w:sz w:val="18"/>
+              </w:rPr>
+              <w:t>Phase 14</w:t>
+            </w:r>
+          </w:p>
+        </w:tc>
+        <w:tc>
+          <w:tcPr>
+            <w:tcW w:type="dxa" w:w="2340"/>
+            <w:shd w:fill="FFFFFF"/>
+            <w:tcMar>
+              <w:top w:w="70" w:type="dxa"/>
+              <w:bottom w:w="70" w:type="dxa"/>
+              <w:left w:w="80" w:type="dxa"/>
+              <w:right w:w="80" w:type="dxa"/>
+            </w:tcMar>
+          </w:tcPr>
+          <w:p>
+            <w:pPr>
+              <w:spacing w:after="0"/>
+              <w:jc w:val="center"/>
+            </w:pPr>
+            <w:r>
+              <w:rPr>
+                <w:color w:val="64748B"/>
+                <w:sz w:val="18"/>
+              </w:rPr>
+              <w:t>2026-08-24</w:t>
+            </w:r>
+          </w:p>
+        </w:tc>
+        <w:tc>
+          <w:tcPr>
+            <w:tcW w:type="dxa" w:w="2340"/>
+            <w:shd w:fill="FFFFFF"/>
+            <w:tcMar>
+              <w:top w:w="70" w:type="dxa"/>
+              <w:bottom w:w="70" w:type="dxa"/>
+              <w:left w:w="80" w:type="dxa"/>
+              <w:right w:w="80" w:type="dxa"/>
+            </w:tcMar>
+          </w:tcPr>
+          <w:p>
+            <w:pPr>
+              <w:spacing w:after="0"/>
+              <w:jc w:val="center"/>
+            </w:pPr>
+            <w:r>
+              <w:rPr>
+                <w:rFonts w:ascii="Consolas" w:hAnsi="Consolas"/>
+                <w:b/>
+                <w:color w:val="1E40AF"/>
+                <w:sz w:val="17"/>
+              </w:rPr>
+              <w:t>bf94dc6</w:t>
+            </w:r>
+          </w:p>
+        </w:tc>
+        <w:tc>
+          <w:tcPr>
+            <w:tcW w:type="dxa" w:w="2340"/>
+            <w:shd w:fill="FFFFFF"/>
+            <w:tcMar>
+              <w:top w:w="70" w:type="dxa"/>
+              <w:bottom w:w="70" w:type="dxa"/>
+              <w:left w:w="100" w:type="dxa"/>
+              <w:right w:w="100" w:type="dxa"/>
+            </w:tcMar>
+          </w:tcPr>
+          <w:p>
+            <w:pPr>
+              <w:spacing w:after="0"/>
+            </w:pPr>
+            <w:r>
+              <w:rPr>
+                <w:color w:val="1E293B"/>
+                <w:sz w:val="18"/>
+              </w:rPr>
+              <w:t>docs: update development report with Phase 14 git record</w:t>
+            </w:r>
+          </w:p>
+        </w:tc>
+      </w:tr>
     </w:tbl>
     <w:p>
       <w:pPr>
@@ -2358,6 +2462,26 @@
           <w:sz w:val="20"/>
         </w:rPr>
         <w:t>Git commit geçmişinden beslenen, sistem mimarisini ve aşama ilerlemelerini derleyen otomatik .docx mühendislik raporu motoru tamamlandı.</w:t>
+      </w:r>
+    </w:p>
+    <w:p>
+      <w:pPr>
+        <w:spacing w:before="80" w:after="40"/>
+      </w:pPr>
+      <w:r>
+        <w:rPr>
+          <w:b/>
+          <w:color w:val="0F172A"/>
+          <w:sz w:val="20"/>
+        </w:rPr>
+        <w:t xml:space="preserve">• Phase 15: Elektronik Harp (EW) ve Jammer Simülasyonu (Electronic Warfare &amp; Jammer): </w:t>
+      </w:r>
+      <w:r>
+        <w:rPr>
+          <w:color w:val="1E293B"/>
+          <w:sz w:val="20"/>
+        </w:rPr>
+        <w:t>Arayüzden kontrol edilen taktik geniş bant Gauss baraj karıştırıcısı (Barrage Jamming), ZMQ iki yönlü kontrol kanalı, canlı spektrum/şelale gürültü basımı ve telemetri bozulma/BER simülasyonu entegre edildi.</w:t>
       </w:r>
     </w:p>
     <w:p>

</xml_diff>

<commit_message>
docs: update development report with Phase 15 git record
</commit_message>
<xml_diff>
--- a/Antigravity_Gelistirme_Raporu.docx
+++ b/Antigravity_Gelistirme_Raporu.docx
@@ -2168,6 +2168,110 @@
           </w:p>
         </w:tc>
       </w:tr>
+      <w:tr>
+        <w:tc>
+          <w:tcPr>
+            <w:tcW w:type="dxa" w:w="2340"/>
+            <w:shd w:fill="F8FAFC"/>
+            <w:tcMar>
+              <w:top w:w="70" w:type="dxa"/>
+              <w:bottom w:w="70" w:type="dxa"/>
+              <w:left w:w="80" w:type="dxa"/>
+              <w:right w:w="80" w:type="dxa"/>
+            </w:tcMar>
+          </w:tcPr>
+          <w:p>
+            <w:pPr>
+              <w:spacing w:after="0"/>
+              <w:jc w:val="center"/>
+            </w:pPr>
+            <w:r>
+              <w:rPr>
+                <w:b/>
+                <w:color w:val="0F172A"/>
+                <w:sz w:val="18"/>
+              </w:rPr>
+              <w:t>Phase 15</w:t>
+            </w:r>
+          </w:p>
+        </w:tc>
+        <w:tc>
+          <w:tcPr>
+            <w:tcW w:type="dxa" w:w="2340"/>
+            <w:shd w:fill="F8FAFC"/>
+            <w:tcMar>
+              <w:top w:w="70" w:type="dxa"/>
+              <w:bottom w:w="70" w:type="dxa"/>
+              <w:left w:w="80" w:type="dxa"/>
+              <w:right w:w="80" w:type="dxa"/>
+            </w:tcMar>
+          </w:tcPr>
+          <w:p>
+            <w:pPr>
+              <w:spacing w:after="0"/>
+              <w:jc w:val="center"/>
+            </w:pPr>
+            <w:r>
+              <w:rPr>
+                <w:color w:val="64748B"/>
+                <w:sz w:val="18"/>
+              </w:rPr>
+              <w:t>2026-08-24</w:t>
+            </w:r>
+          </w:p>
+        </w:tc>
+        <w:tc>
+          <w:tcPr>
+            <w:tcW w:type="dxa" w:w="2340"/>
+            <w:shd w:fill="F8FAFC"/>
+            <w:tcMar>
+              <w:top w:w="70" w:type="dxa"/>
+              <w:bottom w:w="70" w:type="dxa"/>
+              <w:left w:w="80" w:type="dxa"/>
+              <w:right w:w="80" w:type="dxa"/>
+            </w:tcMar>
+          </w:tcPr>
+          <w:p>
+            <w:pPr>
+              <w:spacing w:after="0"/>
+              <w:jc w:val="center"/>
+            </w:pPr>
+            <w:r>
+              <w:rPr>
+                <w:rFonts w:ascii="Consolas" w:hAnsi="Consolas"/>
+                <w:b/>
+                <w:color w:val="1E40AF"/>
+                <w:sz w:val="17"/>
+              </w:rPr>
+              <w:t>dc8662f</w:t>
+            </w:r>
+          </w:p>
+        </w:tc>
+        <w:tc>
+          <w:tcPr>
+            <w:tcW w:type="dxa" w:w="2340"/>
+            <w:shd w:fill="F8FAFC"/>
+            <w:tcMar>
+              <w:top w:w="70" w:type="dxa"/>
+              <w:bottom w:w="70" w:type="dxa"/>
+              <w:left w:w="100" w:type="dxa"/>
+              <w:right w:w="100" w:type="dxa"/>
+            </w:tcMar>
+          </w:tcPr>
+          <w:p>
+            <w:pPr>
+              <w:spacing w:after="0"/>
+            </w:pPr>
+            <w:r>
+              <w:rPr>
+                <w:color w:val="1E293B"/>
+                <w:sz w:val="18"/>
+              </w:rPr>
+              <w:t>feat: complete Phase 15 - Electronic Warfare and Jammer Simulation</w:t>
+            </w:r>
+          </w:p>
+        </w:tc>
+      </w:tr>
     </w:tbl>
     <w:p>
       <w:pPr>

</xml_diff>

<commit_message>
feat: add desktop launcher generator script
</commit_message>
<xml_diff>
--- a/Antigravity_Gelistirme_Raporu.docx
+++ b/Antigravity_Gelistirme_Raporu.docx
@@ -199,7 +199,7 @@
                 <w:color w:val="1E293B"/>
                 <w:sz w:val="19"/>
               </w:rPr>
-              <w:t>24.08.2026 21:23</w:t>
+              <w:t>24.08.2026 21:25</w:t>
             </w:r>
           </w:p>
         </w:tc>
@@ -2272,6 +2272,110 @@
           </w:p>
         </w:tc>
       </w:tr>
+      <w:tr>
+        <w:tc>
+          <w:tcPr>
+            <w:tcW w:type="dxa" w:w="2340"/>
+            <w:shd w:fill="FFFFFF"/>
+            <w:tcMar>
+              <w:top w:w="70" w:type="dxa"/>
+              <w:bottom w:w="70" w:type="dxa"/>
+              <w:left w:w="80" w:type="dxa"/>
+              <w:right w:w="80" w:type="dxa"/>
+            </w:tcMar>
+          </w:tcPr>
+          <w:p>
+            <w:pPr>
+              <w:spacing w:after="0"/>
+              <w:jc w:val="center"/>
+            </w:pPr>
+            <w:r>
+              <w:rPr>
+                <w:b/>
+                <w:color w:val="0F172A"/>
+                <w:sz w:val="18"/>
+              </w:rPr>
+              <w:t>Phase 15</w:t>
+            </w:r>
+          </w:p>
+        </w:tc>
+        <w:tc>
+          <w:tcPr>
+            <w:tcW w:type="dxa" w:w="2340"/>
+            <w:shd w:fill="FFFFFF"/>
+            <w:tcMar>
+              <w:top w:w="70" w:type="dxa"/>
+              <w:bottom w:w="70" w:type="dxa"/>
+              <w:left w:w="80" w:type="dxa"/>
+              <w:right w:w="80" w:type="dxa"/>
+            </w:tcMar>
+          </w:tcPr>
+          <w:p>
+            <w:pPr>
+              <w:spacing w:after="0"/>
+              <w:jc w:val="center"/>
+            </w:pPr>
+            <w:r>
+              <w:rPr>
+                <w:color w:val="64748B"/>
+                <w:sz w:val="18"/>
+              </w:rPr>
+              <w:t>2026-08-24</w:t>
+            </w:r>
+          </w:p>
+        </w:tc>
+        <w:tc>
+          <w:tcPr>
+            <w:tcW w:type="dxa" w:w="2340"/>
+            <w:shd w:fill="FFFFFF"/>
+            <w:tcMar>
+              <w:top w:w="70" w:type="dxa"/>
+              <w:bottom w:w="70" w:type="dxa"/>
+              <w:left w:w="80" w:type="dxa"/>
+              <w:right w:w="80" w:type="dxa"/>
+            </w:tcMar>
+          </w:tcPr>
+          <w:p>
+            <w:pPr>
+              <w:spacing w:after="0"/>
+              <w:jc w:val="center"/>
+            </w:pPr>
+            <w:r>
+              <w:rPr>
+                <w:rFonts w:ascii="Consolas" w:hAnsi="Consolas"/>
+                <w:b/>
+                <w:color w:val="1E40AF"/>
+                <w:sz w:val="17"/>
+              </w:rPr>
+              <w:t>1432138</w:t>
+            </w:r>
+          </w:p>
+        </w:tc>
+        <w:tc>
+          <w:tcPr>
+            <w:tcW w:type="dxa" w:w="2340"/>
+            <w:shd w:fill="FFFFFF"/>
+            <w:tcMar>
+              <w:top w:w="70" w:type="dxa"/>
+              <w:bottom w:w="70" w:type="dxa"/>
+              <w:left w:w="100" w:type="dxa"/>
+              <w:right w:w="100" w:type="dxa"/>
+            </w:tcMar>
+          </w:tcPr>
+          <w:p>
+            <w:pPr>
+              <w:spacing w:after="0"/>
+            </w:pPr>
+            <w:r>
+              <w:rPr>
+                <w:color w:val="1E293B"/>
+                <w:sz w:val="18"/>
+              </w:rPr>
+              <w:t>docs: update development report with Phase 15 git record</w:t>
+            </w:r>
+          </w:p>
+        </w:tc>
+      </w:tr>
     </w:tbl>
     <w:p>
       <w:pPr>

</xml_diff>

<commit_message>
fix: resolve EW Jammer false positive logic and noise floor threshold
</commit_message>
<xml_diff>
--- a/Antigravity_Gelistirme_Raporu.docx
+++ b/Antigravity_Gelistirme_Raporu.docx
@@ -199,7 +199,7 @@
                 <w:color w:val="1E293B"/>
                 <w:sz w:val="19"/>
               </w:rPr>
-              <w:t>24.08.2026 21:25</w:t>
+              <w:t>25.08.2026 18:23</w:t>
             </w:r>
           </w:p>
         </w:tc>
@@ -2376,6 +2376,110 @@
           </w:p>
         </w:tc>
       </w:tr>
+      <w:tr>
+        <w:tc>
+          <w:tcPr>
+            <w:tcW w:type="dxa" w:w="2340"/>
+            <w:shd w:fill="F8FAFC"/>
+            <w:tcMar>
+              <w:top w:w="70" w:type="dxa"/>
+              <w:bottom w:w="70" w:type="dxa"/>
+              <w:left w:w="80" w:type="dxa"/>
+              <w:right w:w="80" w:type="dxa"/>
+            </w:tcMar>
+          </w:tcPr>
+          <w:p>
+            <w:pPr>
+              <w:spacing w:after="0"/>
+              <w:jc w:val="center"/>
+            </w:pPr>
+            <w:r>
+              <w:rPr>
+                <w:b/>
+                <w:color w:val="0F172A"/>
+                <w:sz w:val="18"/>
+              </w:rPr>
+              <w:t>P-18</w:t>
+            </w:r>
+          </w:p>
+        </w:tc>
+        <w:tc>
+          <w:tcPr>
+            <w:tcW w:type="dxa" w:w="2340"/>
+            <w:shd w:fill="F8FAFC"/>
+            <w:tcMar>
+              <w:top w:w="70" w:type="dxa"/>
+              <w:bottom w:w="70" w:type="dxa"/>
+              <w:left w:w="80" w:type="dxa"/>
+              <w:right w:w="80" w:type="dxa"/>
+            </w:tcMar>
+          </w:tcPr>
+          <w:p>
+            <w:pPr>
+              <w:spacing w:after="0"/>
+              <w:jc w:val="center"/>
+            </w:pPr>
+            <w:r>
+              <w:rPr>
+                <w:color w:val="64748B"/>
+                <w:sz w:val="18"/>
+              </w:rPr>
+              <w:t>2026-08-24</w:t>
+            </w:r>
+          </w:p>
+        </w:tc>
+        <w:tc>
+          <w:tcPr>
+            <w:tcW w:type="dxa" w:w="2340"/>
+            <w:shd w:fill="F8FAFC"/>
+            <w:tcMar>
+              <w:top w:w="70" w:type="dxa"/>
+              <w:bottom w:w="70" w:type="dxa"/>
+              <w:left w:w="80" w:type="dxa"/>
+              <w:right w:w="80" w:type="dxa"/>
+            </w:tcMar>
+          </w:tcPr>
+          <w:p>
+            <w:pPr>
+              <w:spacing w:after="0"/>
+              <w:jc w:val="center"/>
+            </w:pPr>
+            <w:r>
+              <w:rPr>
+                <w:rFonts w:ascii="Consolas" w:hAnsi="Consolas"/>
+                <w:b/>
+                <w:color w:val="1E40AF"/>
+                <w:sz w:val="17"/>
+              </w:rPr>
+              <w:t>8bdbc2e</w:t>
+            </w:r>
+          </w:p>
+        </w:tc>
+        <w:tc>
+          <w:tcPr>
+            <w:tcW w:type="dxa" w:w="2340"/>
+            <w:shd w:fill="F8FAFC"/>
+            <w:tcMar>
+              <w:top w:w="70" w:type="dxa"/>
+              <w:bottom w:w="70" w:type="dxa"/>
+              <w:left w:w="100" w:type="dxa"/>
+              <w:right w:w="100" w:type="dxa"/>
+            </w:tcMar>
+          </w:tcPr>
+          <w:p>
+            <w:pPr>
+              <w:spacing w:after="0"/>
+            </w:pPr>
+            <w:r>
+              <w:rPr>
+                <w:color w:val="1E293B"/>
+                <w:sz w:val="18"/>
+              </w:rPr>
+              <w:t>feat: add desktop launcher generator script</w:t>
+            </w:r>
+          </w:p>
+        </w:tc>
+      </w:tr>
     </w:tbl>
     <w:p>
       <w:pPr>

</xml_diff>

<commit_message>
fix: resolve bugs and optimize Jammer/EW module logic
</commit_message>
<xml_diff>
--- a/Antigravity_Gelistirme_Raporu.docx
+++ b/Antigravity_Gelistirme_Raporu.docx
@@ -199,7 +199,7 @@
                 <w:color w:val="1E293B"/>
                 <w:sz w:val="19"/>
               </w:rPr>
-              <w:t>25.08.2026 18:23</w:t>
+              <w:t>25.08.2026 20:14</w:t>
             </w:r>
           </w:p>
         </w:tc>
@@ -2480,6 +2480,110 @@
           </w:p>
         </w:tc>
       </w:tr>
+      <w:tr>
+        <w:tc>
+          <w:tcPr>
+            <w:tcW w:type="dxa" w:w="2340"/>
+            <w:shd w:fill="FFFFFF"/>
+            <w:tcMar>
+              <w:top w:w="70" w:type="dxa"/>
+              <w:bottom w:w="70" w:type="dxa"/>
+              <w:left w:w="80" w:type="dxa"/>
+              <w:right w:w="80" w:type="dxa"/>
+            </w:tcMar>
+          </w:tcPr>
+          <w:p>
+            <w:pPr>
+              <w:spacing w:after="0"/>
+              <w:jc w:val="center"/>
+            </w:pPr>
+            <w:r>
+              <w:rPr>
+                <w:b/>
+                <w:color w:val="0F172A"/>
+                <w:sz w:val="18"/>
+              </w:rPr>
+              <w:t>P-19</w:t>
+            </w:r>
+          </w:p>
+        </w:tc>
+        <w:tc>
+          <w:tcPr>
+            <w:tcW w:type="dxa" w:w="2340"/>
+            <w:shd w:fill="FFFFFF"/>
+            <w:tcMar>
+              <w:top w:w="70" w:type="dxa"/>
+              <w:bottom w:w="70" w:type="dxa"/>
+              <w:left w:w="80" w:type="dxa"/>
+              <w:right w:w="80" w:type="dxa"/>
+            </w:tcMar>
+          </w:tcPr>
+          <w:p>
+            <w:pPr>
+              <w:spacing w:after="0"/>
+              <w:jc w:val="center"/>
+            </w:pPr>
+            <w:r>
+              <w:rPr>
+                <w:color w:val="64748B"/>
+                <w:sz w:val="18"/>
+              </w:rPr>
+              <w:t>2026-08-25</w:t>
+            </w:r>
+          </w:p>
+        </w:tc>
+        <w:tc>
+          <w:tcPr>
+            <w:tcW w:type="dxa" w:w="2340"/>
+            <w:shd w:fill="FFFFFF"/>
+            <w:tcMar>
+              <w:top w:w="70" w:type="dxa"/>
+              <w:bottom w:w="70" w:type="dxa"/>
+              <w:left w:w="80" w:type="dxa"/>
+              <w:right w:w="80" w:type="dxa"/>
+            </w:tcMar>
+          </w:tcPr>
+          <w:p>
+            <w:pPr>
+              <w:spacing w:after="0"/>
+              <w:jc w:val="center"/>
+            </w:pPr>
+            <w:r>
+              <w:rPr>
+                <w:rFonts w:ascii="Consolas" w:hAnsi="Consolas"/>
+                <w:b/>
+                <w:color w:val="1E40AF"/>
+                <w:sz w:val="17"/>
+              </w:rPr>
+              <w:t>e7cdb7a</w:t>
+            </w:r>
+          </w:p>
+        </w:tc>
+        <w:tc>
+          <w:tcPr>
+            <w:tcW w:type="dxa" w:w="2340"/>
+            <w:shd w:fill="FFFFFF"/>
+            <w:tcMar>
+              <w:top w:w="70" w:type="dxa"/>
+              <w:bottom w:w="70" w:type="dxa"/>
+              <w:left w:w="100" w:type="dxa"/>
+              <w:right w:w="100" w:type="dxa"/>
+            </w:tcMar>
+          </w:tcPr>
+          <w:p>
+            <w:pPr>
+              <w:spacing w:after="0"/>
+            </w:pPr>
+            <w:r>
+              <w:rPr>
+                <w:color w:val="1E293B"/>
+                <w:sz w:val="18"/>
+              </w:rPr>
+              <w:t>fix: resolve EW Jammer false positive logic and noise floor threshold</w:t>
+            </w:r>
+          </w:p>
+        </w:tc>
+      </w:tr>
     </w:tbl>
     <w:p>
       <w:pPr>

</xml_diff>